<commit_message>
Actualizar ChatLog 2.0.1: modularización, recuperación y respaldos
</commit_message>
<xml_diff>
--- a/manuals/Manual_Usuario_ChatLog_v2.0.1.docx
+++ b/manuals/Manual_Usuario_ChatLog_v2.0.1.docx
@@ -1514,7 +1514,7 @@
         <w:pStyle w:val="Normal"/>
       </w:pPr>
       <w:r>
-        <w:t>En Referencia de la interacción elige Enlace web a la conversación si tienes una URL compartible, o Archivo de evidencia conservada si guardaste una exportación, transcripción o capturas en tu equipo. En el segundo caso escribe el nombre y la ubicación del archivo, preferiblemente relativos a la carpeta del proyecto. ChatLog no adjunta ni abre esos archivos. No inventes una URL ni publiques conversaciones confidenciales para llenar este campo.</w:t>
+        <w:t>En Referencia de la interacción elige Enlace web a la conversación si tienes una URL de la conversación, o Archivo de evidencia conservada si guardaste una exportación, transcripción o capturas. En Nombre y ubicación del archivo puedes escribir una ruta en tu equipo, preferiblemente relativa al proyecto, o pegar la URL del archivo en Google Drive o OneDrive. ChatLog no adjunta ni abre el archivo ni comprueba sus permisos de acceso. No necesitas publicar conversaciones confidenciales para llenar este campo.</w:t>
       </w:r>
     </w:p>
     <w:p>
@@ -1586,7 +1586,7 @@
         <w:pStyle w:val="Normal"/>
       </w:pPr>
       <w:r>
-        <w:t>5. Selecciona Archivo de evidencia conservada y escribe en Nombre y ubicación del archivo una referencia como Evidencias/2026-10-01_revision-pregunta-investigacion.pdf. En Observaciones indica la aplicación utilizada, qué mensajes contiene el archivo y si es un extracto. ChatLog guarda la referencia, pero no adjunta ni abre el archivo.</w:t>
+        <w:t>5. Selecciona Archivo de evidencia conservada. En Nombre y ubicación del archivo escribe una ruta como Evidencias/2026-10-01_revision-pregunta-investigacion.pdf, o pega la URL del archivo en Google Drive o OneDrive. En Observaciones indica qué mensajes contiene y si es un extracto. ChatLog guarda la referencia; no adjunta ni abre el archivo ni comprueba sus permisos. Si otra persona necesita revisarlo, comprueba que tenga acceso al archivo.</w:t>
       </w:r>
     </w:p>
     <w:p>
@@ -1682,7 +1682,7 @@
         <w:pStyle w:val="Normal"/>
       </w:pPr>
       <w:r>
-        <w:t>La exportación respeta el alcance seleccionado. Ambos formatos conservan las referencias de evidencia, pero no incluyen los archivos del disco. Copia también la carpeta de evidencias al respaldar o trasladar tu proyecto.</w:t>
+        <w:t>La exportación respeta el alcance seleccionado. Ambos formatos conservan las rutas y URLs de evidencia, pero no incluyen los archivos. Respalda también los archivos de evidencia, tanto si están en tu equipo como en Google Drive o OneDrive.</w:t>
       </w:r>
     </w:p>
     <w:p>

</xml_diff>